<commit_message>
Refine W3 writing flow and optional AI support
</commit_message>
<xml_diff>
--- a/worksheets/W3.docx
+++ b/worksheets/W3.docx
@@ -286,7 +286,7 @@
           <w:color w:val="5B6573"/>
           <w:sz w:val="22"/>
         </w:rPr>
-        <w:t>下課前整本收回保管；W5 再用 W2、W4 與本週原作查核學習關卡 1。AI／同學只能提問或選細節；你要看懂建議、決定怎麼用，並確認短文符合自己的記憶。不要求分享私人內容。</w:t>
+        <w:t>下課前整本收回保管；W5 再用 W2、W4 與本週原作查核學習關卡 1。短文由你親自寫；聽懂別人的選法後，自己決定怎麼用，並確認內容符合記憶。不要求分享私人內容。</w:t>
       </w:r>
     </w:p>
     <w:p>
@@ -377,7 +377,7 @@
       </w:tblGrid>
       <w:tr>
         <w:trPr>
-          <w:trHeight w:val="510" w:hRule="atLeast"/>
+          <w:trHeight w:val="907" w:hRule="atLeast"/>
         </w:trPr>
         <w:tc>
           <w:tcPr>
@@ -418,7 +418,6 @@
                 <w:color w:val="5B6573"/>
                 <w:sz w:val="22"/>
               </w:rPr>
-              <w:t>大概地點＋一個動作：</w:t>
             </w:r>
           </w:p>
         </w:tc>
@@ -461,14 +460,13 @@
                 <w:color w:val="5B6573"/>
                 <w:sz w:val="22"/>
               </w:rPr>
-              <w:t>大概地點＋一個動作：</w:t>
             </w:r>
           </w:p>
         </w:tc>
       </w:tr>
       <w:tr>
         <w:trPr>
-          <w:trHeight w:val="510" w:hRule="atLeast"/>
+          <w:trHeight w:val="907" w:hRule="atLeast"/>
         </w:trPr>
         <w:tc>
           <w:tcPr>
@@ -509,7 +507,6 @@
                 <w:color w:val="5B6573"/>
                 <w:sz w:val="22"/>
               </w:rPr>
-              <w:t>大概地點＋一個動作：</w:t>
             </w:r>
           </w:p>
         </w:tc>
@@ -552,14 +549,13 @@
                 <w:color w:val="5B6573"/>
                 <w:sz w:val="22"/>
               </w:rPr>
-              <w:t>大概地點＋一個動作：</w:t>
             </w:r>
           </w:p>
         </w:tc>
       </w:tr>
       <w:tr>
         <w:trPr>
-          <w:trHeight w:val="510" w:hRule="atLeast"/>
+          <w:trHeight w:val="907" w:hRule="atLeast"/>
         </w:trPr>
         <w:tc>
           <w:tcPr>
@@ -600,7 +596,6 @@
                 <w:color w:val="5B6573"/>
                 <w:sz w:val="22"/>
               </w:rPr>
-              <w:t>大概地點＋一個動作：</w:t>
             </w:r>
           </w:p>
         </w:tc>
@@ -643,14 +638,13 @@
                 <w:color w:val="5B6573"/>
                 <w:sz w:val="22"/>
               </w:rPr>
-              <w:t>大概地點＋一個動作：</w:t>
             </w:r>
           </w:p>
         </w:tc>
       </w:tr>
       <w:tr>
         <w:trPr>
-          <w:trHeight w:val="510" w:hRule="atLeast"/>
+          <w:trHeight w:val="907" w:hRule="atLeast"/>
         </w:trPr>
         <w:tc>
           <w:tcPr>
@@ -691,7 +685,6 @@
                 <w:color w:val="5B6573"/>
                 <w:sz w:val="22"/>
               </w:rPr>
-              <w:t>大概地點＋一個動作：</w:t>
             </w:r>
           </w:p>
         </w:tc>
@@ -734,14 +727,13 @@
                 <w:color w:val="5B6573"/>
                 <w:sz w:val="22"/>
               </w:rPr>
-              <w:t>大概地點＋一個動作：</w:t>
             </w:r>
           </w:p>
         </w:tc>
       </w:tr>
       <w:tr>
         <w:trPr>
-          <w:trHeight w:val="510" w:hRule="atLeast"/>
+          <w:trHeight w:val="907" w:hRule="atLeast"/>
         </w:trPr>
         <w:tc>
           <w:tcPr>
@@ -782,7 +774,6 @@
                 <w:color w:val="5B6573"/>
                 <w:sz w:val="22"/>
               </w:rPr>
-              <w:t>大概地點＋一個動作：</w:t>
             </w:r>
           </w:p>
         </w:tc>
@@ -825,7 +816,6 @@
                 <w:color w:val="5B6573"/>
                 <w:sz w:val="22"/>
               </w:rPr>
-              <w:t>大概地點＋一個動作：</w:t>
             </w:r>
           </w:p>
         </w:tc>
@@ -1029,7 +1019,7 @@
           <w:color w:val="5B6573"/>
           <w:sz w:val="22"/>
         </w:rPr>
-        <w:t>願意分享才給同桌看；不想分享可用老師的公開例子，不影響完成。</w:t>
+        <w:t>願意分享才給同桌看；不想分享可用《公開練習素材卡》，不影響完成。</w:t>
       </w:r>
     </w:p>
     <w:p>
@@ -1089,7 +1079,7 @@
           <w:color w:val="5B6573"/>
           <w:sz w:val="22"/>
         </w:rPr>
-        <w:t>有裝置用 AI，沒有就用紙本六題；兩種做法都算完成。</w:t>
+        <w:t>先自問、記關鍵字，再到第 3 頁開始寫。</w:t>
       </w:r>
     </w:p>
     <w:p>
@@ -1283,7 +1273,7 @@
                 <w:color w:val="C2414D"/>
                 <w:sz w:val="22"/>
               </w:rPr>
-              <w:t>不要輸入</w:t>
+              <w:t>不寫／不提供</w:t>
             </w:r>
             <w:r>
               <w:rPr>
@@ -1333,7 +1323,7 @@
           <w:color w:val="1A2340"/>
           <w:sz w:val="30"/>
         </w:rPr>
-        <w:t>選一條路，把細節找回來</w:t>
+        <w:t>先自己找細節，再試寫</w:t>
       </w:r>
     </w:p>
     <w:tbl>
@@ -1370,7 +1360,7 @@
             <w:pPr>
               <w:keepNext w:val="0"/>
               <w:keepLines w:val="0"/>
-              <w:spacing w:before="0" w:after="80" w:line="293" w:lineRule="auto"/>
+              <w:spacing w:before="0" w:after="0" w:line="293" w:lineRule="auto"/>
             </w:pPr>
             <w:r>
               <w:rPr>
@@ -1380,7 +1370,7 @@
                 <w:color w:val="1D4ED8"/>
                 <w:sz w:val="22"/>
               </w:rPr>
-              <w:t>🧭 可選用 AI</w:t>
+              <w:t>🔒 不使用 AI</w:t>
             </w:r>
             <w:r>
               <w:rPr>
@@ -1390,24 +1380,7 @@
                 <w:color w:val="1A2340"/>
                 <w:sz w:val="22"/>
               </w:rPr>
-              <w:t xml:space="preserve">　想不起細節時，可讓 AI 一次問一題；不用 AI 就照下面六題。兩條路都把關鍵字寫進同一張表。</w:t>
-            </w:r>
-          </w:p>
-          <w:p>
-            <w:pPr>
-              <w:keepNext w:val="0"/>
-              <w:keepLines w:val="0"/>
-              <w:spacing w:before="0" w:after="0" w:line="293" w:lineRule="auto"/>
-            </w:pPr>
-            <w:r>
-              <w:rPr>
-                <w:rFonts w:ascii="Arial Unicode MS" w:hAnsi="Arial Unicode MS" w:eastAsia="Arial Unicode MS"/>
-                <w:b w:val="0"/>
-                <w:i w:val="0"/>
-                <w:color w:val="1A2340"/>
-                <w:sz w:val="22"/>
-              </w:rPr>
-              <w:t>AI 可以提問，稍後也可以從既有答案選 3 個細節；它不能代寫或增加新事實。你要核對內容，最後由你決定並負責。</w:t>
+              <w:t xml:space="preserve">　先自己回想、記關鍵字並試寫；不用等到想齊才動筆。</w:t>
             </w:r>
           </w:p>
         </w:tc>
@@ -1461,7 +1434,7 @@
           <w:color w:val="5B6573"/>
           <w:sz w:val="22"/>
         </w:rPr>
-        <w:t>AI 完整指令可從網站簡報複製。把答案的關鍵字寫在下面；六題是上限，四題或想起足夠細節就能停。</w:t>
+        <w:t>先寫記得的關鍵字，不必六題全答；不記得就寫「不確定」。有材料就到第 3 頁 05 試寫一兩句，能寫就繼續。</w:t>
       </w:r>
     </w:p>
     <w:tbl>
@@ -1927,6 +1900,23 @@
     </w:tbl>
     <w:p>
       <w:pPr>
+        <w:keepNext w:val="0"/>
+        <w:keepLines w:val="0"/>
+        <w:spacing w:before="60" w:after="0" w:line="293" w:lineRule="auto"/>
+      </w:pPr>
+      <w:r>
+        <w:rPr>
+          <w:rFonts w:ascii="Arial Unicode MS" w:hAnsi="Arial Unicode MS" w:eastAsia="Arial Unicode MS"/>
+          <w:b w:val="0"/>
+          <w:i w:val="0"/>
+          <w:color w:val="5B6573"/>
+          <w:sz w:val="22"/>
+        </w:rPr>
+        <w:t>🧭 可選用 AI｜先嘗試後仍卡住，再由老師帶入一次一題的追問。只提供安全三行，不代寫、不補事實；核對後補在原表，55 分鐘回到自己寫。</w:t>
+      </w:r>
+    </w:p>
+    <w:p>
+      <w:pPr>
         <w:spacing w:after="0"/>
       </w:pPr>
       <w:r>
@@ -1982,7 +1972,7 @@
           <w:color w:val="5B6573"/>
           <w:sz w:val="22"/>
         </w:rPr>
-        <w:t>AI 可以幫你找細節；哪些值得留下，要你自己決定。</w:t>
+        <w:t>先自己寫，聽另一個選法，再做自己的決定。</w:t>
       </w:r>
     </w:p>
     <w:p>
@@ -2033,10 +2023,10 @@
           <w:rFonts w:ascii="Arial Unicode MS" w:hAnsi="Arial Unicode MS" w:eastAsia="Arial Unicode MS"/>
           <w:b/>
           <w:i w:val="0"/>
-          <w:color w:val="1D4ED8"/>
+          <w:color w:val="5B6573"/>
           <w:sz w:val="22"/>
         </w:rPr>
-        <w:t>課堂必寫</w:t>
+        <w:t>課堂必寫｜自己寫</w:t>
       </w:r>
       <w:r>
         <w:rPr>
@@ -2056,7 +2046,7 @@
           <w:color w:val="1A2340"/>
           <w:sz w:val="22"/>
         </w:rPr>
-        <w:t>寫發生了什麼；放進 3–5 個細節，其中至少 2 個要具體。</w:t>
+        <w:t>從剛才的開頭續寫；放進 3–5 個細節，其中至少 2 個要具體。</w:t>
       </w:r>
     </w:p>
     <w:tbl>
@@ -2325,7 +2315,7 @@
           <w:color w:val="5B6573"/>
           <w:sz w:val="22"/>
         </w:rPr>
-        <w:t>提早完成：回看另外兩個圈選瞬間，各想一句『為什麼最後沒選它？』</w:t>
+        <w:t>比較後：在下表圈出最後想留的 3 項；相同細節只算 1 項。保留原文與原選擇，不擦掉。</w:t>
       </w:r>
     </w:p>
     <w:p>
@@ -2362,7 +2352,7 @@
           <w:color w:val="1A2340"/>
           <w:sz w:val="30"/>
         </w:rPr>
-        <w:t>只比細節，不請 AI 寫第二篇</w:t>
+        <w:t>同一批答案，比較選擇</w:t>
       </w:r>
     </w:p>
     <w:p>
@@ -2379,7 +2369,7 @@
           <w:color w:val="5B6573"/>
           <w:sz w:val="22"/>
         </w:rPr>
-        <w:t>AI：從我的回答選 3 個具體細節，各用一句話說明原因；不改寫文章、不加新內容。沒有裝置又願意分享，就請同學看第 2 頁六題答案整頁，從同一批內容選 3 個。</w:t>
+        <w:t>先記自己的三項，再請同學從第 2 頁全部答案選 3 項、說理由。🧭 可選用 AI 做相同選材；不改寫、不加新事實，最後自己核對與決定。不分享私人內容可用公開素材。</w:t>
       </w:r>
     </w:p>
     <w:tbl>
@@ -2484,7 +2474,7 @@
                 <w:color w:val="1A2340"/>
                 <w:sz w:val="22"/>
               </w:rPr>
-              <w:t>AI／同學選的</w:t>
+              <w:t>同學／AI 選的</w:t>
             </w:r>
           </w:p>
         </w:tc>
@@ -2869,9 +2859,17 @@
     </w:tbl>
     <w:p>
       <w:pPr>
+        <w:spacing w:after="0"/>
+      </w:pPr>
+      <w:r>
+        <w:br w:type="page"/>
+      </w:r>
+    </w:p>
+    <w:p>
+      <w:pPr>
         <w:keepNext/>
         <w:keepLines w:val="0"/>
-        <w:pageBreakBefore/>
+        <w:pageBreakBefore w:val="0"/>
         <w:spacing w:before="0" w:after="60" w:line="293" w:lineRule="auto"/>
       </w:pPr>
       <w:r>
@@ -2899,7 +2897,7 @@
           <w:color w:val="1A2340"/>
           <w:sz w:val="44"/>
         </w:rPr>
-        <w:t>換個情境，再試一次</w:t>
+        <w:t>先試寫，再換個情境</w:t>
       </w:r>
     </w:p>
     <w:p>
@@ -2916,14 +2914,14 @@
           <w:color w:val="5B6573"/>
           <w:sz w:val="22"/>
         </w:rPr>
-        <w:t>不計分、不列學習關卡；用題目情境，不必交出私事。</w:t>
+        <w:t>課堂練習｜不計分、不列學習關卡；整本照常收回。</w:t>
       </w:r>
     </w:p>
     <w:p>
       <w:pPr>
         <w:keepNext/>
         <w:keepLines w:val="0"/>
-        <w:spacing w:before="100" w:after="40" w:line="293" w:lineRule="auto"/>
+        <w:spacing w:before="40" w:after="100" w:line="293" w:lineRule="auto"/>
       </w:pPr>
       <w:r>
         <w:rPr>
@@ -2933,7 +2931,7 @@
           <w:color w:val="1D4ED8"/>
           <w:sz w:val="30"/>
         </w:rPr>
-        <w:t>生活</w:t>
+        <w:t>暖身</w:t>
       </w:r>
       <w:r>
         <w:rPr>
@@ -2953,14 +2951,14 @@
           <w:color w:val="1A2340"/>
           <w:sz w:val="30"/>
         </w:rPr>
-        <w:t>晚到補習班，怎麼說清楚？</w:t>
+        <w:t>三個鏡頭，連成意思</w:t>
       </w:r>
     </w:p>
     <w:p>
       <w:pPr>
         <w:keepNext w:val="0"/>
         <w:keepLines w:val="0"/>
-        <w:spacing w:before="0" w:after="40" w:line="293" w:lineRule="auto"/>
+        <w:spacing w:before="0" w:after="80" w:line="293" w:lineRule="auto"/>
       </w:pPr>
       <w:r>
         <w:rPr>
@@ -2970,14 +2968,34 @@
           <w:color w:val="5B6573"/>
           <w:sz w:val="22"/>
         </w:rPr>
-        <w:t>課堂練習｜不計分、不列學習關卡；整本照常收回。</w:t>
+        <w:t xml:space="preserve">我先選 </w:t>
+      </w:r>
+      <w:r>
+        <w:rPr>
+          <w:rFonts w:ascii="JetBrains Mono" w:hAnsi="JetBrains Mono" w:eastAsia="Arial Unicode MS"/>
+          <w:b w:val="0"/>
+          <w:i w:val="0"/>
+          <w:color w:val="1A2340"/>
+          <w:sz w:val="22"/>
+        </w:rPr>
+        <w:t>____、____、____</w:t>
+      </w:r>
+      <w:r>
+        <w:rPr>
+          <w:rFonts w:ascii="Arial Unicode MS" w:hAnsi="Arial Unicode MS" w:eastAsia="Arial Unicode MS"/>
+          <w:b w:val="0"/>
+          <w:i w:val="0"/>
+          <w:color w:val="5B6573"/>
+          <w:sz w:val="22"/>
+        </w:rPr>
+        <w:t>，想讓人看懂 ____________________。</w:t>
       </w:r>
     </w:p>
     <w:p>
       <w:pPr>
         <w:keepNext w:val="0"/>
         <w:keepLines w:val="0"/>
-        <w:spacing w:before="0" w:after="40" w:line="293" w:lineRule="auto"/>
+        <w:spacing w:before="0" w:after="20" w:line="293" w:lineRule="auto"/>
       </w:pPr>
       <w:r>
         <w:rPr>
@@ -2987,61 +3005,7 @@
           <w:color w:val="1A2340"/>
           <w:sz w:val="22"/>
         </w:rPr>
-        <w:t>你在公車上。車子故障、司機請大家下車、你改搭下一班、估計晚到十五分鐘、晚餐吃麵、旁邊有人打瞌睡、天色很暗。</w:t>
-      </w:r>
-    </w:p>
-    <w:p>
-      <w:pPr>
-        <w:keepNext w:val="0"/>
-        <w:keepLines w:val="0"/>
-        <w:spacing w:before="0" w:after="40" w:line="293" w:lineRule="auto"/>
-      </w:pPr>
-      <w:r>
-        <w:rPr>
-          <w:rFonts w:ascii="Arial Unicode MS" w:hAnsi="Arial Unicode MS" w:eastAsia="Arial Unicode MS"/>
-          <w:b w:val="0"/>
-          <w:i w:val="0"/>
-          <w:color w:val="1A2340"/>
-          <w:sz w:val="22"/>
-        </w:rPr>
-        <w:t>補習班老師問你在哪裡。從這些事情選最需要的三項，寫一則四十字內的回覆。</w:t>
-      </w:r>
-    </w:p>
-    <w:p>
-      <w:pPr>
-        <w:keepNext/>
-        <w:keepLines w:val="0"/>
-        <w:spacing w:before="20" w:after="20" w:line="293" w:lineRule="auto"/>
-      </w:pPr>
-      <w:r>
-        <w:rPr>
-          <w:rFonts w:ascii="Arial Unicode MS" w:hAnsi="Arial Unicode MS" w:eastAsia="Arial Unicode MS"/>
-          <w:b/>
-          <w:i w:val="0"/>
-          <w:color w:val="5B6573"/>
-          <w:sz w:val="22"/>
-        </w:rPr>
-        <w:t>先做一次</w:t>
-      </w:r>
-      <w:r>
-        <w:rPr>
-          <w:rFonts w:ascii="Arial Unicode MS" w:hAnsi="Arial Unicode MS" w:eastAsia="Arial Unicode MS"/>
-          <w:b w:val="0"/>
-          <w:i w:val="0"/>
-          <w:color w:val="7B8491"/>
-          <w:sz w:val="22"/>
-        </w:rPr>
-        <w:t xml:space="preserve">  ｜  </w:t>
-      </w:r>
-      <w:r>
-        <w:rPr>
-          <w:rFonts w:ascii="Arial Unicode MS" w:hAnsi="Arial Unicode MS" w:eastAsia="Arial Unicode MS"/>
-          <w:b w:val="0"/>
-          <w:i w:val="0"/>
-          <w:color w:val="1A2340"/>
-          <w:sz w:val="22"/>
-        </w:rPr>
-        <w:t>我選的三項與回覆</w:t>
+        <w:t>各找一個具體細節，試寫 2–3 句。接不起來可換一個，不補原片沒有的事。</w:t>
       </w:r>
     </w:p>
     <w:tbl>
@@ -3150,17 +3114,54 @@
       <w:pPr>
         <w:keepNext w:val="0"/>
         <w:keepLines w:val="0"/>
-        <w:spacing w:before="60" w:after="40" w:line="293" w:lineRule="auto"/>
+        <w:spacing w:before="0" w:after="40" w:line="293" w:lineRule="auto"/>
       </w:pPr>
+      <w:r>
+        <w:rPr>
+          <w:rFonts w:ascii="Arial Unicode MS" w:hAnsi="Arial Unicode MS" w:eastAsia="Arial Unicode MS"/>
+          <w:b w:val="0"/>
+          <w:i w:val="0"/>
+          <w:color w:val="5B6573"/>
+          <w:sz w:val="22"/>
+        </w:rPr>
+        <w:t>同桌只依文字回讀：『我從你的文字，讀到＿＿。』不靠影片記憶補完。</w:t>
+      </w:r>
+    </w:p>
+    <w:p>
+      <w:pPr>
+        <w:keepNext/>
+        <w:keepLines w:val="0"/>
+        <w:spacing w:before="80" w:after="100" w:line="293" w:lineRule="auto"/>
+      </w:pPr>
+      <w:r>
+        <w:rPr>
+          <w:rFonts w:ascii="JetBrains Mono" w:hAnsi="JetBrains Mono" w:eastAsia="Arial Unicode MS"/>
+          <w:b/>
+          <w:i w:val="0"/>
+          <w:color w:val="1D4ED8"/>
+          <w:sz w:val="30"/>
+        </w:rPr>
+        <w:t>課末</w:t>
+      </w:r>
+      <w:r>
+        <w:rPr>
+          <w:rFonts w:ascii="Arial Unicode MS" w:hAnsi="Arial Unicode MS" w:eastAsia="Arial Unicode MS"/>
+          <w:b w:val="0"/>
+          <w:i w:val="0"/>
+          <w:color w:val="1D4ED8"/>
+          <w:sz w:val="30"/>
+        </w:rPr>
+        <w:t xml:space="preserve">  </w:t>
+      </w:r>
       <w:r>
         <w:rPr>
           <w:rFonts w:ascii="Arial Unicode MS" w:hAnsi="Arial Unicode MS" w:eastAsia="Arial Unicode MS"/>
           <w:b/>
           <w:i w:val="0"/>
           <w:color w:val="1A2340"/>
-          <w:sz w:val="22"/>
+          <w:sz w:val="30"/>
         </w:rPr>
-        <w:t>先寫完，再看：老師回：『我不是問原因，我要知道要不要先開始上課。』</w:t>
+        <w:t>請同學找對你的水壺</w:t>
       </w:r>
     </w:p>
     <w:p>
@@ -3177,7 +3178,7 @@
           <w:color w:val="1A2340"/>
           <w:sz w:val="22"/>
         </w:rPr>
-        <w:t>再看你的回覆：哪一項該留、哪一項可以刪？改一次，留下刪留理由。</w:t>
+        <w:t>課堂模擬：你的水壺是黑色的，有藍色提帶、山形貼紙，底部有一處凹痕。同學正好經過失物台，願意幫你找。</w:t>
       </w:r>
     </w:p>
     <w:p>
@@ -3194,7 +3195,7 @@
           <w:color w:val="5B6573"/>
           <w:sz w:val="22"/>
         </w:rPr>
-        <w:t>再決定</w:t>
+        <w:t>先做一次</w:t>
       </w:r>
       <w:r>
         <w:rPr>
@@ -3214,7 +3215,7 @@
           <w:color w:val="1A2340"/>
           <w:sz w:val="22"/>
         </w:rPr>
-        <w:t>我改了／保留哪一項，因為</w:t>
+        <w:t>挑兩個你認為最有用的特徵，寫一句訊息給他。先保留初答，不擦掉。</w:t>
       </w:r>
     </w:p>
     <w:tbl>
@@ -3280,6 +3281,139 @@
           </w:tcPr>
           <w:p>
             <w:pPr>
+              <w:spacing w:before="0" w:after="20" w:line="240" w:lineRule="auto"/>
+            </w:pPr>
+            <w:r>
+              <w:t xml:space="preserve"> </w:t>
+            </w:r>
+          </w:p>
+        </w:tc>
+      </w:tr>
+    </w:tbl>
+    <w:p>
+      <w:pPr>
+        <w:keepNext w:val="0"/>
+        <w:keepLines w:val="0"/>
+        <w:spacing w:before="40" w:after="20" w:line="293" w:lineRule="auto"/>
+      </w:pPr>
+      <w:r>
+        <w:rPr>
+          <w:rFonts w:ascii="Arial Unicode MS" w:hAnsi="Arial Unicode MS" w:eastAsia="Arial Unicode MS"/>
+          <w:b/>
+          <w:i w:val="0"/>
+          <w:color w:val="1A2340"/>
+          <w:sz w:val="22"/>
+        </w:rPr>
+        <w:t>先寫完，等老師投影失物台；先保留原答，再核對。</w:t>
+      </w:r>
+    </w:p>
+    <w:p>
+      <w:pPr>
+        <w:keepNext w:val="0"/>
+        <w:keepLines w:val="0"/>
+        <w:spacing w:before="0" w:after="80" w:line="293" w:lineRule="auto"/>
+      </w:pPr>
+      <w:r>
+        <w:rPr>
+          <w:rFonts w:ascii="Arial Unicode MS" w:hAnsi="Arial Unicode MS" w:eastAsia="Arial Unicode MS"/>
+          <w:b w:val="0"/>
+          <w:i w:val="0"/>
+          <w:color w:val="5B6573"/>
+          <w:sz w:val="22"/>
+        </w:rPr>
+        <w:t>只照我的原訊息，可能拿到：</w:t>
+      </w:r>
+      <w:r>
+        <w:rPr>
+          <w:rFonts w:ascii="JetBrains Mono" w:hAnsi="JetBrains Mono" w:eastAsia="Arial Unicode MS"/>
+          <w:b w:val="0"/>
+          <w:i w:val="0"/>
+          <w:color w:val="1A2340"/>
+          <w:sz w:val="22"/>
+        </w:rPr>
+        <w:t>________________</w:t>
+      </w:r>
+      <w:r>
+        <w:rPr>
+          <w:rFonts w:ascii="Arial Unicode MS" w:hAnsi="Arial Unicode MS" w:eastAsia="Arial Unicode MS"/>
+          <w:b w:val="0"/>
+          <w:i w:val="0"/>
+          <w:color w:val="5B6573"/>
+          <w:sz w:val="22"/>
+        </w:rPr>
+        <w:t>（所有符合的編號）。</w:t>
+      </w:r>
+    </w:p>
+    <w:p>
+      <w:pPr>
+        <w:keepNext/>
+        <w:keepLines w:val="0"/>
+        <w:spacing w:before="40" w:after="20" w:line="293" w:lineRule="auto"/>
+      </w:pPr>
+      <w:r>
+        <w:rPr>
+          <w:rFonts w:ascii="Arial Unicode MS" w:hAnsi="Arial Unicode MS" w:eastAsia="Arial Unicode MS"/>
+          <w:b/>
+          <w:i w:val="0"/>
+          <w:color w:val="5B6573"/>
+          <w:sz w:val="22"/>
+        </w:rPr>
+        <w:t>再決定</w:t>
+      </w:r>
+      <w:r>
+        <w:rPr>
+          <w:rFonts w:ascii="Arial Unicode MS" w:hAnsi="Arial Unicode MS" w:eastAsia="Arial Unicode MS"/>
+          <w:b w:val="0"/>
+          <w:i w:val="0"/>
+          <w:color w:val="7B8491"/>
+          <w:sz w:val="22"/>
+        </w:rPr>
+        <w:t xml:space="preserve">  ｜  </w:t>
+      </w:r>
+      <w:r>
+        <w:rPr>
+          <w:rFonts w:ascii="Arial Unicode MS" w:hAnsi="Arial Unicode MS" w:eastAsia="Arial Unicode MS"/>
+          <w:b w:val="0"/>
+          <w:i w:val="0"/>
+          <w:color w:val="1A2340"/>
+          <w:sz w:val="22"/>
+        </w:rPr>
+        <w:t>□ 修改　□ 保留。現在的訊息（仍用兩個特徵）：</w:t>
+      </w:r>
+    </w:p>
+    <w:tbl>
+      <w:tblPr>
+        <w:tblW w:type="dxa" w:w="9865"/>
+        <w:jc w:val="left"/>
+        <w:tblLayout w:type="fixed"/>
+        <w:tblLook w:firstColumn="1" w:firstRow="1" w:lastColumn="0" w:lastRow="0" w:noHBand="0" w:noVBand="1" w:val="04A0"/>
+        <w:tblInd w:type="dxa" w:w="0"/>
+      </w:tblPr>
+      <w:tblGrid>
+        <w:gridCol w:w="9865"/>
+      </w:tblGrid>
+      <w:tr>
+        <w:trPr>
+          <w:trHeight w:val="510" w:hRule="atLeast"/>
+        </w:trPr>
+        <w:tc>
+          <w:tcPr>
+            <w:tcW w:type="dxa" w:w="9865"/>
+            <w:tcMar>
+              <w:top w:w="0" w:type="dxa"/>
+              <w:start w:w="0" w:type="dxa"/>
+              <w:bottom w:w="0" w:type="dxa"/>
+              <w:end w:w="0" w:type="dxa"/>
+            </w:tcMar>
+            <w:tcBorders>
+              <w:top w:val="nil"/>
+              <w:bottom w:val="single" w:sz="5" w:space="0" w:color="CBD5E1"/>
+              <w:start w:val="nil"/>
+              <w:end w:val="nil"/>
+            </w:tcBorders>
+          </w:tcPr>
+          <w:p>
+            <w:pPr>
               <w:spacing w:before="0" w:after="0" w:line="240" w:lineRule="auto"/>
             </w:pPr>
             <w:r>
@@ -3321,46 +3455,9 @@
     </w:tbl>
     <w:p>
       <w:pPr>
-        <w:keepNext/>
-        <w:keepLines w:val="0"/>
-        <w:spacing w:before="100" w:after="100" w:line="293" w:lineRule="auto"/>
-      </w:pPr>
-      <w:r>
-        <w:rPr>
-          <w:rFonts w:ascii="JetBrains Mono" w:hAnsi="JetBrains Mono" w:eastAsia="Arial Unicode MS"/>
-          <w:b/>
-          <w:i w:val="0"/>
-          <w:color w:val="1D4ED8"/>
-          <w:sz w:val="30"/>
-        </w:rPr>
-        <w:t>下一週</w:t>
-      </w:r>
-      <w:r>
-        <w:rPr>
-          <w:rFonts w:ascii="Arial Unicode MS" w:hAnsi="Arial Unicode MS" w:eastAsia="Arial Unicode MS"/>
-          <w:b w:val="0"/>
-          <w:i w:val="0"/>
-          <w:color w:val="1D4ED8"/>
-          <w:sz w:val="30"/>
-        </w:rPr>
-        <w:t xml:space="preserve">  </w:t>
-      </w:r>
-      <w:r>
-        <w:rPr>
-          <w:rFonts w:ascii="Arial Unicode MS" w:hAnsi="Arial Unicode MS" w:eastAsia="Arial Unicode MS"/>
-          <w:b/>
-          <w:i w:val="0"/>
-          <w:color w:val="1A2340"/>
-          <w:sz w:val="30"/>
-        </w:rPr>
-        <w:t>W4 會接著用</w:t>
-      </w:r>
-    </w:p>
-    <w:p>
-      <w:pPr>
         <w:keepNext w:val="0"/>
         <w:keepLines w:val="0"/>
-        <w:spacing w:before="0" w:after="40" w:line="293" w:lineRule="auto"/>
+        <w:spacing w:before="0" w:after="20" w:line="293" w:lineRule="auto"/>
       </w:pPr>
       <w:r>
         <w:rPr>
@@ -3370,41 +3467,96 @@
           <w:color w:val="1A2340"/>
           <w:sz w:val="22"/>
         </w:rPr>
-        <w:t>第 3 頁已留下最後三個細節與刪留理由，這裡不用再抄一次。</w:t>
+        <w:t>理由：我換掉／保留了什麼？現在會對上哪幾個，為什麼？</w:t>
       </w:r>
     </w:p>
+    <w:tbl>
+      <w:tblPr>
+        <w:tblW w:type="dxa" w:w="9865"/>
+        <w:jc w:val="left"/>
+        <w:tblLayout w:type="fixed"/>
+        <w:tblLook w:firstColumn="1" w:firstRow="1" w:lastColumn="0" w:lastRow="0" w:noHBand="0" w:noVBand="1" w:val="04A0"/>
+        <w:tblInd w:type="dxa" w:w="0"/>
+      </w:tblPr>
+      <w:tblGrid>
+        <w:gridCol w:w="9865"/>
+      </w:tblGrid>
+      <w:tr>
+        <w:trPr>
+          <w:trHeight w:val="510" w:hRule="atLeast"/>
+        </w:trPr>
+        <w:tc>
+          <w:tcPr>
+            <w:tcW w:type="dxa" w:w="9865"/>
+            <w:tcMar>
+              <w:top w:w="0" w:type="dxa"/>
+              <w:start w:w="0" w:type="dxa"/>
+              <w:bottom w:w="0" w:type="dxa"/>
+              <w:end w:w="0" w:type="dxa"/>
+            </w:tcMar>
+            <w:tcBorders>
+              <w:top w:val="nil"/>
+              <w:bottom w:val="single" w:sz="5" w:space="0" w:color="CBD5E1"/>
+              <w:start w:val="nil"/>
+              <w:end w:val="nil"/>
+            </w:tcBorders>
+          </w:tcPr>
+          <w:p>
+            <w:pPr>
+              <w:spacing w:before="0" w:after="0" w:line="240" w:lineRule="auto"/>
+            </w:pPr>
+            <w:r>
+              <w:t xml:space="preserve"> </w:t>
+            </w:r>
+          </w:p>
+        </w:tc>
+      </w:tr>
+      <w:tr>
+        <w:trPr>
+          <w:trHeight w:val="510" w:hRule="atLeast"/>
+        </w:trPr>
+        <w:tc>
+          <w:tcPr>
+            <w:tcW w:type="dxa" w:w="9865"/>
+            <w:tcMar>
+              <w:top w:w="0" w:type="dxa"/>
+              <w:start w:w="0" w:type="dxa"/>
+              <w:bottom w:w="0" w:type="dxa"/>
+              <w:end w:w="0" w:type="dxa"/>
+            </w:tcMar>
+            <w:tcBorders>
+              <w:top w:val="nil"/>
+              <w:bottom w:val="single" w:sz="5" w:space="0" w:color="CBD5E1"/>
+              <w:start w:val="nil"/>
+              <w:end w:val="nil"/>
+            </w:tcBorders>
+          </w:tcPr>
+          <w:p>
+            <w:pPr>
+              <w:spacing w:before="0" w:after="20" w:line="240" w:lineRule="auto"/>
+            </w:pPr>
+            <w:r>
+              <w:t xml:space="preserve"> </w:t>
+            </w:r>
+          </w:p>
+        </w:tc>
+      </w:tr>
+    </w:tbl>
     <w:p>
       <w:pPr>
         <w:keepNext w:val="0"/>
         <w:keepLines w:val="0"/>
-        <w:spacing w:before="0" w:after="40" w:line="293" w:lineRule="auto"/>
+        <w:spacing w:before="40" w:after="0" w:line="293" w:lineRule="auto"/>
       </w:pPr>
       <w:r>
         <w:rPr>
           <w:rFonts w:ascii="Arial Unicode MS" w:hAnsi="Arial Unicode MS" w:eastAsia="Arial Unicode MS"/>
           <w:b w:val="0"/>
           <w:i w:val="0"/>
-          <w:color w:val="1A2340"/>
+          <w:color w:val="5B6573"/>
           <w:sz w:val="22"/>
         </w:rPr>
-        <w:t>確認：至少列八個、圈三個，寫五十到一百字；短文至少兩個具體細節；最後決定有理由。</w:t>
-      </w:r>
-    </w:p>
-    <w:p>
-      <w:pPr>
-        <w:keepNext w:val="0"/>
-        <w:keepLines w:val="0"/>
-        <w:spacing w:before="100" w:after="0" w:line="293" w:lineRule="auto"/>
-      </w:pPr>
-      <w:r>
-        <w:rPr>
-          <w:rFonts w:ascii="Arial Unicode MS" w:hAnsi="Arial Unicode MS" w:eastAsia="Arial Unicode MS"/>
-          <w:b/>
-          <w:i w:val="0"/>
-          <w:color w:val="1D4ED8"/>
-          <w:sz w:val="22"/>
-        </w:rPr>
-        <w:t>收件：只拍自己的頁面上傳 Classroom，確認已繳交，再把整本交回；不拍同學。</w:t>
+        <w:t>W4 接著用第 3 頁原文與最後決定；不用另抄摘要。</w:t>
       </w:r>
     </w:p>
     <w:sectPr>

</xml_diff>